<commit_message>
fix: render rasters declared as the wrong raster format (#1009)
</commit_message>
<xml_diff>
--- a/e2e/fixtures/images-external.docx
+++ b/e2e/fixtures/images-external.docx
@@ -92,13 +92,13 @@
     </w:p>
     <w:p>
       <w:r>
-        <w:t>MIME spoof</w:t>
+        <w:t>PNG bytes declared as JPEG</w:t>
       </w:r>
       <w:r>
         <w:drawing>
           <wp:inline distT="0" distB="0" distL="0" distR="0">
-            <wp:extent cx="914400" cy="914400"/>
-            <wp:docPr id="3" name="spoof"/>
+            <wp:extent cx="3657600" cy="2194560"/>
+            <wp:docPr id="3" name="raster content type mismatch"/>
             <wp:cNvGraphicFramePr/>
             <a:graphic xmlns:a="http://schemas.openxmlformats.org/drawingml/2006/main">
               <a:graphicData uri="http://schemas.openxmlformats.org/drawingml/2006/picture">
@@ -117,7 +117,7 @@
                   <pic:spPr>
                     <a:xfrm rot="0" flipH="0" flipV="0">
                       <a:off x="0" y="0"/>
-                      <a:ext cx="914400" cy="914400"/>
+                      <a:ext cx="3657600" cy="2194560"/>
                     </a:xfrm>
                     <a:prstGeom prst="rect">
                       <a:avLst/>

</xml_diff>